<commit_message>
Implement team messaging feature with posting and notification functionality
</commit_message>
<xml_diff>
--- a/Amateur Sports Team Organiser- Abdirahman Jimale- Final Year Project.docx
+++ b/Amateur Sports Team Organiser- Abdirahman Jimale- Final Year Project.docx
@@ -7379,118 +7379,312 @@
         <w:t>FR1 to FR6 Results</w:t>
       </w:r>
     </w:p>
-    <w:p>
-      <w:pPr>
-        <w:pStyle w:val="BodyText"/>
-      </w:pPr>
-      <w:r>
-        <w:t>ID | Requirement Summary | Validation Method | Result |</w:t>
-      </w:r>
-    </w:p>
-    <w:p>
-      <w:pPr>
-        <w:pStyle w:val="BodyText"/>
-      </w:pPr>
-      <w:r>
-        <w:t>|—|—|—|—|</w:t>
-      </w:r>
-    </w:p>
-    <w:p>
-      <w:pPr>
-        <w:pStyle w:val="BodyText"/>
-      </w:pPr>
-      <w:r>
-        <w:t>FR1 | Organiser authorisation control | Registration + role access</w:t>
-      </w:r>
-    </w:p>
-    <w:p>
-      <w:pPr>
-        <w:pStyle w:val="BodyText"/>
-      </w:pPr>
-      <w:r>
-        <w:t>checks (pytest and Playwright) | Met |</w:t>
-      </w:r>
-    </w:p>
-    <w:p>
-      <w:pPr>
-        <w:pStyle w:val="BodyText"/>
-      </w:pPr>
-      <w:r>
-        <w:t>FR2 | Up-to-date upcoming session view | Dashboard filter tests and</w:t>
-      </w:r>
-    </w:p>
-    <w:p>
-      <w:pPr>
-        <w:pStyle w:val="BodyText"/>
-      </w:pPr>
-      <w:r>
-        <w:t>Playwright checks | Met |</w:t>
-      </w:r>
-    </w:p>
-    <w:p>
-      <w:pPr>
-        <w:pStyle w:val="BodyText"/>
-      </w:pPr>
-      <w:r>
-        <w:t>FR3 | Availability capture per session | RSVP flow inspection and</w:t>
-      </w:r>
-    </w:p>
-    <w:p>
-      <w:pPr>
-        <w:pStyle w:val="BodyText"/>
-      </w:pPr>
-      <w:r>
-        <w:t>route behaviour checks | Met |</w:t>
-      </w:r>
-    </w:p>
-    <w:p>
-      <w:pPr>
-        <w:pStyle w:val="BodyText"/>
-      </w:pPr>
-      <w:r>
-        <w:t>FR4 | Notification on session updates | Notification route/template</w:t>
-      </w:r>
-    </w:p>
-    <w:p>
-      <w:pPr>
-        <w:pStyle w:val="BodyText"/>
-      </w:pPr>
-      <w:r>
-        <w:t>verification and manual flow test | Met |</w:t>
-      </w:r>
-    </w:p>
-    <w:p>
-      <w:pPr>
-        <w:pStyle w:val="BodyText"/>
-      </w:pPr>
-      <w:r>
-        <w:t>FR5 | Open-session controls in normal create flow | UI test for</w:t>
-      </w:r>
-    </w:p>
-    <w:p>
-      <w:pPr>
-        <w:pStyle w:val="BodyText"/>
-      </w:pPr>
-      <w:r>
-        <w:t>open/capacity controls on create-event page | Met |</w:t>
-      </w:r>
-    </w:p>
-    <w:p>
-      <w:pPr>
-        <w:pStyle w:val="BodyText"/>
-      </w:pPr>
-      <w:r>
-        <w:t>FR6 | Open sessions filtered to those needing players | Query/filter</w:t>
-      </w:r>
-    </w:p>
-    <w:p>
-      <w:pPr>
-        <w:pStyle w:val="BodyText"/>
-      </w:pPr>
-      <w:r>
-        <w:t>verification + Playwright behaviour checks | Met |</w:t>
-      </w:r>
-    </w:p>
+    <w:tbl>
+      <w:tblPr>
+        <w:tblW w:type="auto" w:w="0"/>
+        <w:tblLook w:firstColumn="1" w:firstRow="1" w:lastColumn="0" w:lastRow="0" w:noHBand="0" w:noVBand="1" w:val="04A0"/>
+      </w:tblPr>
+      <w:tblGrid>
+        <w:gridCol w:w="2269"/>
+        <w:gridCol w:w="2269"/>
+        <w:gridCol w:w="2269"/>
+        <w:gridCol w:w="2269"/>
+      </w:tblGrid>
+      <w:tr>
+        <w:tc>
+          <w:tcPr>
+            <w:tcW w:type="dxa" w:w="2269"/>
+          </w:tcPr>
+          <w:p>
+            <w:r>
+              <w:t>ID</w:t>
+            </w:r>
+          </w:p>
+        </w:tc>
+        <w:tc>
+          <w:tcPr>
+            <w:tcW w:type="dxa" w:w="2269"/>
+          </w:tcPr>
+          <w:p>
+            <w:r>
+              <w:t>Requirement Summary</w:t>
+            </w:r>
+          </w:p>
+        </w:tc>
+        <w:tc>
+          <w:tcPr>
+            <w:tcW w:type="dxa" w:w="2269"/>
+          </w:tcPr>
+          <w:p>
+            <w:r>
+              <w:t>Validation Method</w:t>
+            </w:r>
+          </w:p>
+        </w:tc>
+        <w:tc>
+          <w:tcPr>
+            <w:tcW w:type="dxa" w:w="2269"/>
+          </w:tcPr>
+          <w:p>
+            <w:r>
+              <w:t>Result</w:t>
+            </w:r>
+          </w:p>
+        </w:tc>
+      </w:tr>
+      <w:tr>
+        <w:tc>
+          <w:tcPr>
+            <w:tcW w:type="dxa" w:w="2269"/>
+          </w:tcPr>
+          <w:p>
+            <w:r>
+              <w:t>FR1</w:t>
+            </w:r>
+          </w:p>
+        </w:tc>
+        <w:tc>
+          <w:tcPr>
+            <w:tcW w:type="dxa" w:w="2269"/>
+          </w:tcPr>
+          <w:p>
+            <w:r>
+              <w:t>Organiser authorisation control</w:t>
+            </w:r>
+          </w:p>
+        </w:tc>
+        <w:tc>
+          <w:tcPr>
+            <w:tcW w:type="dxa" w:w="2269"/>
+          </w:tcPr>
+          <w:p>
+            <w:r>
+              <w:t>Registration + role access checks (pytest and Playwright)</w:t>
+            </w:r>
+          </w:p>
+        </w:tc>
+        <w:tc>
+          <w:tcPr>
+            <w:tcW w:type="dxa" w:w="2269"/>
+          </w:tcPr>
+          <w:p>
+            <w:r>
+              <w:t>Met</w:t>
+            </w:r>
+          </w:p>
+        </w:tc>
+      </w:tr>
+      <w:tr>
+        <w:tc>
+          <w:tcPr>
+            <w:tcW w:type="dxa" w:w="2269"/>
+          </w:tcPr>
+          <w:p>
+            <w:r>
+              <w:t>FR2</w:t>
+            </w:r>
+          </w:p>
+        </w:tc>
+        <w:tc>
+          <w:tcPr>
+            <w:tcW w:type="dxa" w:w="2269"/>
+          </w:tcPr>
+          <w:p>
+            <w:r>
+              <w:t>Up-to-date upcoming session view</w:t>
+            </w:r>
+          </w:p>
+        </w:tc>
+        <w:tc>
+          <w:tcPr>
+            <w:tcW w:type="dxa" w:w="2269"/>
+          </w:tcPr>
+          <w:p>
+            <w:r>
+              <w:t>Dashboard filter tests and Playwright checks</w:t>
+            </w:r>
+          </w:p>
+        </w:tc>
+        <w:tc>
+          <w:tcPr>
+            <w:tcW w:type="dxa" w:w="2269"/>
+          </w:tcPr>
+          <w:p>
+            <w:r>
+              <w:t>Met</w:t>
+            </w:r>
+          </w:p>
+        </w:tc>
+      </w:tr>
+      <w:tr>
+        <w:tc>
+          <w:tcPr>
+            <w:tcW w:type="dxa" w:w="2269"/>
+          </w:tcPr>
+          <w:p>
+            <w:r>
+              <w:t>FR3</w:t>
+            </w:r>
+          </w:p>
+        </w:tc>
+        <w:tc>
+          <w:tcPr>
+            <w:tcW w:type="dxa" w:w="2269"/>
+          </w:tcPr>
+          <w:p>
+            <w:r>
+              <w:t>Availability capture per session</w:t>
+            </w:r>
+          </w:p>
+        </w:tc>
+        <w:tc>
+          <w:tcPr>
+            <w:tcW w:type="dxa" w:w="2269"/>
+          </w:tcPr>
+          <w:p>
+            <w:r>
+              <w:t>RSVP flow inspection and route behaviour checks</w:t>
+            </w:r>
+          </w:p>
+        </w:tc>
+        <w:tc>
+          <w:tcPr>
+            <w:tcW w:type="dxa" w:w="2269"/>
+          </w:tcPr>
+          <w:p>
+            <w:r>
+              <w:t>Met</w:t>
+            </w:r>
+          </w:p>
+        </w:tc>
+      </w:tr>
+      <w:tr>
+        <w:tc>
+          <w:tcPr>
+            <w:tcW w:type="dxa" w:w="2269"/>
+          </w:tcPr>
+          <w:p>
+            <w:r>
+              <w:t>FR4</w:t>
+            </w:r>
+          </w:p>
+        </w:tc>
+        <w:tc>
+          <w:tcPr>
+            <w:tcW w:type="dxa" w:w="2269"/>
+          </w:tcPr>
+          <w:p>
+            <w:r>
+              <w:t>Notification on session updates</w:t>
+            </w:r>
+          </w:p>
+        </w:tc>
+        <w:tc>
+          <w:tcPr>
+            <w:tcW w:type="dxa" w:w="2269"/>
+          </w:tcPr>
+          <w:p>
+            <w:r>
+              <w:t>Notification route/template verification and manual flow test</w:t>
+            </w:r>
+          </w:p>
+        </w:tc>
+        <w:tc>
+          <w:tcPr>
+            <w:tcW w:type="dxa" w:w="2269"/>
+          </w:tcPr>
+          <w:p>
+            <w:r>
+              <w:t>Met</w:t>
+            </w:r>
+          </w:p>
+        </w:tc>
+      </w:tr>
+      <w:tr>
+        <w:tc>
+          <w:tcPr>
+            <w:tcW w:type="dxa" w:w="2269"/>
+          </w:tcPr>
+          <w:p>
+            <w:r>
+              <w:t>FR5</w:t>
+            </w:r>
+          </w:p>
+        </w:tc>
+        <w:tc>
+          <w:tcPr>
+            <w:tcW w:type="dxa" w:w="2269"/>
+          </w:tcPr>
+          <w:p>
+            <w:r>
+              <w:t>Open-session controls in normal create flow</w:t>
+            </w:r>
+          </w:p>
+        </w:tc>
+        <w:tc>
+          <w:tcPr>
+            <w:tcW w:type="dxa" w:w="2269"/>
+          </w:tcPr>
+          <w:p>
+            <w:r>
+              <w:t>UI test for open/capacity controls on create-event page</w:t>
+            </w:r>
+          </w:p>
+        </w:tc>
+        <w:tc>
+          <w:tcPr>
+            <w:tcW w:type="dxa" w:w="2269"/>
+          </w:tcPr>
+          <w:p>
+            <w:r>
+              <w:t>Met</w:t>
+            </w:r>
+          </w:p>
+        </w:tc>
+      </w:tr>
+      <w:tr>
+        <w:tc>
+          <w:tcPr>
+            <w:tcW w:type="dxa" w:w="2269"/>
+          </w:tcPr>
+          <w:p>
+            <w:r>
+              <w:t>FR6</w:t>
+            </w:r>
+          </w:p>
+        </w:tc>
+        <w:tc>
+          <w:tcPr>
+            <w:tcW w:type="dxa" w:w="2269"/>
+          </w:tcPr>
+          <w:p>
+            <w:r>
+              <w:t>Open sessions filtered to those needing players</w:t>
+            </w:r>
+          </w:p>
+        </w:tc>
+        <w:tc>
+          <w:tcPr>
+            <w:tcW w:type="dxa" w:w="2269"/>
+          </w:tcPr>
+          <w:p>
+            <w:r>
+              <w:t>Query/filter verification + Playwright behaviour checks</w:t>
+            </w:r>
+          </w:p>
+        </w:tc>
+        <w:tc>
+          <w:tcPr>
+            <w:tcW w:type="dxa" w:w="2269"/>
+          </w:tcPr>
+          <w:p>
+            <w:r>
+              <w:t>Met</w:t>
+            </w:r>
+          </w:p>
+        </w:tc>
+      </w:tr>
+    </w:tbl>
     <w:p>
       <w:pPr>
         <w:pStyle w:val="BodyText"/>
@@ -7593,83 +7787,228 @@
       </w:r>
       <w:bookmarkEnd w:id="81"/>
     </w:p>
-    <w:p>
-      <w:r>
-        <w:t>ID | Non-Functional Requirement | Evidence | Result |</w:t>
-      </w:r>
-    </w:p>
-    <w:p>
-      <w:pPr>
-        <w:pStyle w:val="BodyText"/>
-      </w:pPr>
-      <w:r>
-        <w:t>|—|—|—|—|</w:t>
-      </w:r>
-    </w:p>
-    <w:p>
-      <w:pPr>
-        <w:pStyle w:val="BodyText"/>
-      </w:pPr>
-      <w:r>
-        <w:t>NFR1 | Usable by users with limited technical experience | Task-based</w:t>
-      </w:r>
-    </w:p>
-    <w:p>
-      <w:pPr>
-        <w:pStyle w:val="BodyText"/>
-      </w:pPr>
-      <w:r>
-        <w:t>Playwright walkthroughs of registration, login, dashboard, and RSVP | Met |</w:t>
-      </w:r>
-    </w:p>
-    <w:p>
-      <w:pPr>
-        <w:pStyle w:val="BodyText"/>
-      </w:pPr>
-      <w:r>
-        <w:t>NFR2 | Accessible on common mobile devices | Mobile viewport test at</w:t>
-      </w:r>
-    </w:p>
-    <w:p>
-      <w:pPr>
-        <w:pStyle w:val="BodyText"/>
-      </w:pPr>
-      <w:r>
-        <w:t>390x844 with no horizontal overflow | Met |</w:t>
-      </w:r>
-    </w:p>
-    <w:p>
-      <w:pPr>
-        <w:pStyle w:val="BodyText"/>
-      </w:pPr>
-      <w:r>
-        <w:t>NFR3 | Free to use for organisers and players | Open-source stack and</w:t>
-      </w:r>
-    </w:p>
-    <w:p>
-      <w:pPr>
-        <w:pStyle w:val="BodyText"/>
-      </w:pPr>
-      <w:r>
-        <w:t>no paid core dependencies | Met |</w:t>
-      </w:r>
-    </w:p>
-    <w:p>
-      <w:pPr>
-        <w:pStyle w:val="BodyText"/>
-      </w:pPr>
-      <w:r>
-        <w:t>NFR4 | Reliable access to accurate session information | Time-based</w:t>
-      </w:r>
-    </w:p>
-    <w:p>
-      <w:pPr>
-        <w:pStyle w:val="BodyText"/>
-      </w:pPr>
-      <w:r>
-        <w:t>filtering + dependency guards + repeatable regression tests | Met |</w:t>
-      </w:r>
-    </w:p>
+    <w:tbl>
+      <w:tblPr>
+        <w:tblW w:type="auto" w:w="0"/>
+        <w:tblLook w:firstColumn="1" w:firstRow="1" w:lastColumn="0" w:lastRow="0" w:noHBand="0" w:noVBand="1" w:val="04A0"/>
+      </w:tblPr>
+      <w:tblGrid>
+        <w:gridCol w:w="2269"/>
+        <w:gridCol w:w="2269"/>
+        <w:gridCol w:w="2269"/>
+        <w:gridCol w:w="2269"/>
+      </w:tblGrid>
+      <w:tr>
+        <w:tc>
+          <w:tcPr>
+            <w:tcW w:type="dxa" w:w="2269"/>
+          </w:tcPr>
+          <w:p>
+            <w:r>
+              <w:t>ID</w:t>
+            </w:r>
+          </w:p>
+        </w:tc>
+        <w:tc>
+          <w:tcPr>
+            <w:tcW w:type="dxa" w:w="2269"/>
+          </w:tcPr>
+          <w:p>
+            <w:r>
+              <w:t>Non-Functional Requirement</w:t>
+            </w:r>
+          </w:p>
+        </w:tc>
+        <w:tc>
+          <w:tcPr>
+            <w:tcW w:type="dxa" w:w="2269"/>
+          </w:tcPr>
+          <w:p>
+            <w:r>
+              <w:t>Evidence</w:t>
+            </w:r>
+          </w:p>
+        </w:tc>
+        <w:tc>
+          <w:tcPr>
+            <w:tcW w:type="dxa" w:w="2269"/>
+          </w:tcPr>
+          <w:p>
+            <w:r>
+              <w:t>Result</w:t>
+            </w:r>
+          </w:p>
+        </w:tc>
+      </w:tr>
+      <w:tr>
+        <w:tc>
+          <w:tcPr>
+            <w:tcW w:type="dxa" w:w="2269"/>
+          </w:tcPr>
+          <w:p>
+            <w:r>
+              <w:t>NFR1</w:t>
+            </w:r>
+          </w:p>
+        </w:tc>
+        <w:tc>
+          <w:tcPr>
+            <w:tcW w:type="dxa" w:w="2269"/>
+          </w:tcPr>
+          <w:p>
+            <w:r>
+              <w:t>Usable by users with limited technical experience</w:t>
+            </w:r>
+          </w:p>
+        </w:tc>
+        <w:tc>
+          <w:tcPr>
+            <w:tcW w:type="dxa" w:w="2269"/>
+          </w:tcPr>
+          <w:p>
+            <w:r>
+              <w:t>Task-based Playwright walkthroughs of registration, login, dashboard, and RSVP</w:t>
+            </w:r>
+          </w:p>
+        </w:tc>
+        <w:tc>
+          <w:tcPr>
+            <w:tcW w:type="dxa" w:w="2269"/>
+          </w:tcPr>
+          <w:p>
+            <w:r>
+              <w:t>Met</w:t>
+            </w:r>
+          </w:p>
+        </w:tc>
+      </w:tr>
+      <w:tr>
+        <w:tc>
+          <w:tcPr>
+            <w:tcW w:type="dxa" w:w="2269"/>
+          </w:tcPr>
+          <w:p>
+            <w:r>
+              <w:t>NFR2</w:t>
+            </w:r>
+          </w:p>
+        </w:tc>
+        <w:tc>
+          <w:tcPr>
+            <w:tcW w:type="dxa" w:w="2269"/>
+          </w:tcPr>
+          <w:p>
+            <w:r>
+              <w:t>Accessible on common mobile devices</w:t>
+            </w:r>
+          </w:p>
+        </w:tc>
+        <w:tc>
+          <w:tcPr>
+            <w:tcW w:type="dxa" w:w="2269"/>
+          </w:tcPr>
+          <w:p>
+            <w:r>
+              <w:t>Mobile viewport test at 390x844 with no horizontal overflow</w:t>
+            </w:r>
+          </w:p>
+        </w:tc>
+        <w:tc>
+          <w:tcPr>
+            <w:tcW w:type="dxa" w:w="2269"/>
+          </w:tcPr>
+          <w:p>
+            <w:r>
+              <w:t>Met</w:t>
+            </w:r>
+          </w:p>
+        </w:tc>
+      </w:tr>
+      <w:tr>
+        <w:tc>
+          <w:tcPr>
+            <w:tcW w:type="dxa" w:w="2269"/>
+          </w:tcPr>
+          <w:p>
+            <w:r>
+              <w:t>NFR3</w:t>
+            </w:r>
+          </w:p>
+        </w:tc>
+        <w:tc>
+          <w:tcPr>
+            <w:tcW w:type="dxa" w:w="2269"/>
+          </w:tcPr>
+          <w:p>
+            <w:r>
+              <w:t>Free to use for organisers and players</w:t>
+            </w:r>
+          </w:p>
+        </w:tc>
+        <w:tc>
+          <w:tcPr>
+            <w:tcW w:type="dxa" w:w="2269"/>
+          </w:tcPr>
+          <w:p>
+            <w:r>
+              <w:t>Open-source stack and no paid core dependencies</w:t>
+            </w:r>
+          </w:p>
+        </w:tc>
+        <w:tc>
+          <w:tcPr>
+            <w:tcW w:type="dxa" w:w="2269"/>
+          </w:tcPr>
+          <w:p>
+            <w:r>
+              <w:t>Met</w:t>
+            </w:r>
+          </w:p>
+        </w:tc>
+      </w:tr>
+      <w:tr>
+        <w:tc>
+          <w:tcPr>
+            <w:tcW w:type="dxa" w:w="2269"/>
+          </w:tcPr>
+          <w:p>
+            <w:r>
+              <w:t>NFR4</w:t>
+            </w:r>
+          </w:p>
+        </w:tc>
+        <w:tc>
+          <w:tcPr>
+            <w:tcW w:type="dxa" w:w="2269"/>
+          </w:tcPr>
+          <w:p>
+            <w:r>
+              <w:t>Reliable access to accurate session information</w:t>
+            </w:r>
+          </w:p>
+        </w:tc>
+        <w:tc>
+          <w:tcPr>
+            <w:tcW w:type="dxa" w:w="2269"/>
+          </w:tcPr>
+          <w:p>
+            <w:r>
+              <w:t>Time-based filtering + dependency guards + repeatable regression tests</w:t>
+            </w:r>
+          </w:p>
+        </w:tc>
+        <w:tc>
+          <w:tcPr>
+            <w:tcW w:type="dxa" w:w="2269"/>
+          </w:tcPr>
+          <w:p>
+            <w:r>
+              <w:t>Met</w:t>
+            </w:r>
+          </w:p>
+        </w:tc>
+      </w:tr>
+    </w:tbl>
     <w:p>
       <w:pPr>
         <w:pStyle w:val="BodyText"/>
@@ -8050,6 +8389,294 @@
     <w:p>
       <w:r>
         <w:t>Testing and validation demonstrate that ASTO now meets FR1-FR6 and NFR1-NFR4 with evidence from automated tests, browser-based scenario validation, and mobile responsiveness checks. The critical review confirms that the project achieved its core purpose while identifying practical areas for technical and research enhancement.</w:t>
+      </w:r>
+    </w:p>
+    <w:p>
+      <w:pPr>
+        <w:pStyle w:val="Heading1"/>
+      </w:pPr>
+      <w:r>
+        <w:t>Chapter 6: Conclusion</w:t>
+      </w:r>
+    </w:p>
+    <w:p>
+      <w:pPr>
+        <w:pStyle w:val="Heading2"/>
+      </w:pPr>
+      <w:r>
+        <w:t>6.1 Chapter Overview</w:t>
+      </w:r>
+    </w:p>
+    <w:p>
+      <w:pPr/>
+      <w:r>
+        <w:t>This chapter concludes the Amateur Sports Team Organiser (ASTO) project by reflecting on the overall outcomes in relation to the original problem, aims, and objectives. It summarises the key contributions of the system, evaluates its effectiveness within the intended context, and highlights its practical value for amateur sports teams. The chapter also provides a final perspective on the project as a complete, end-to-end solution.</w:t>
+      </w:r>
+    </w:p>
+    <w:p>
+      <w:pPr>
+        <w:pStyle w:val="Heading2"/>
+      </w:pPr>
+      <w:r>
+        <w:t>6.2 Summary of the Problem and Project Aim</w:t>
+      </w:r>
+    </w:p>
+    <w:p>
+      <w:pPr/>
+      <w:r>
+        <w:t>As established in Chapter 1, amateur sports teams frequently rely on informal communication tools such as messaging applications and spreadsheets to organise sessions. While these tools are accessible, they often result in fragmented information, missed updates, and uncertainty around attendance. These issues place unnecessary pressure on organisers and reduce overall coordination efficiency.</w:t>
+      </w:r>
+    </w:p>
+    <w:p>
+      <w:pPr/>
+      <w:r>
+        <w:t>The aim of this project was to address these challenges by improving how scheduling, communication, and participation are managed within amateur sports teams, while maintaining simplicity and accessibility. Rather than introducing a feature-heavy platform, the focus was on delivering a lightweight solution aligned with real stakeholder needs.</w:t>
+      </w:r>
+    </w:p>
+    <w:p>
+      <w:pPr>
+        <w:pStyle w:val="Heading2"/>
+      </w:pPr>
+      <w:r>
+        <w:t>6.3 Summary of System Contribution</w:t>
+      </w:r>
+    </w:p>
+    <w:p>
+      <w:pPr/>
+      <w:r>
+        <w:t>The ASTO prototype provides a centralised, web-based system that consolidates key coordination tasks into a single interface. The system enables:</w:t>
+      </w:r>
+    </w:p>
+    <w:p>
+      <w:pPr>
+        <w:pStyle w:val="ListParagraph"/>
+      </w:pPr>
+      <w:r>
+        <w:t>Clear visibility of upcoming sessions through a structured dashboard</w:t>
+      </w:r>
+    </w:p>
+    <w:p>
+      <w:pPr>
+        <w:pStyle w:val="ListParagraph"/>
+      </w:pPr>
+      <w:r>
+        <w:t>Explicit attendance tracking via RSVP states (Yes/Maybe/No)</w:t>
+      </w:r>
+    </w:p>
+    <w:p>
+      <w:pPr>
+        <w:pStyle w:val="ListParagraph"/>
+      </w:pPr>
+      <w:r>
+        <w:t>Organiser-controlled session management, including open-session functionality</w:t>
+      </w:r>
+    </w:p>
+    <w:p>
+      <w:pPr>
+        <w:pStyle w:val="ListParagraph"/>
+      </w:pPr>
+      <w:r>
+        <w:t>Consistent communication through in-app notification mechanisms</w:t>
+      </w:r>
+    </w:p>
+    <w:p>
+      <w:pPr/>
+      <w:r>
+        <w:t>These features directly address the issues identified during stakeholder engagement, particularly the lack of reliable information visibility and uncertainty around participation. By grounding the system design in stakeholder evidence, the project maintains a strong link between real-world problems and implemented functionality.</w:t>
+      </w:r>
+    </w:p>
+    <w:p>
+      <w:pPr>
+        <w:pStyle w:val="Heading2"/>
+      </w:pPr>
+      <w:r>
+        <w:t>6.4 Evaluation of Project Outcomes</w:t>
+      </w:r>
+    </w:p>
+    <w:p>
+      <w:pPr/>
+      <w:r>
+        <w:t>The evaluation presented in Chapter 5 demonstrates that the system successfully meets all defined functional requirements (FR1-FR6) and non-functional requirements (NFR1-NFR4). Automated testing, browser-based validation, and usability observations collectively confirm that the system operates as intended and provides a usable experience for target users.</w:t>
+      </w:r>
+    </w:p>
+    <w:p>
+      <w:pPr/>
+      <w:r>
+        <w:t>Compared to existing solutions discussed in Chapter 1, ASTO offers several contextual advantages:</w:t>
+      </w:r>
+    </w:p>
+    <w:p>
+      <w:pPr>
+        <w:pStyle w:val="ListParagraph"/>
+      </w:pPr>
+      <w:r>
+        <w:t>Unlike commercial platforms such as TeamSnap, the system avoids unnecessary complexity and subscription-based barriers</w:t>
+      </w:r>
+    </w:p>
+    <w:p>
+      <w:pPr>
+        <w:pStyle w:val="ListParagraph"/>
+      </w:pPr>
+      <w:r>
+        <w:t>Unlike advertisement-supported platforms such as Heja, it maintains a clean and focused user experience</w:t>
+      </w:r>
+    </w:p>
+    <w:p>
+      <w:pPr>
+        <w:pStyle w:val="ListParagraph"/>
+      </w:pPr>
+      <w:r>
+        <w:t>Unlike informal tools such as WhatsApp, it provides structured and persistent session information</w:t>
+      </w:r>
+    </w:p>
+    <w:p>
+      <w:pPr/>
+      <w:r>
+        <w:t>These differences highlight the value of a purpose-built solution designed specifically for amateur and volunteer-led teams.</w:t>
+      </w:r>
+    </w:p>
+    <w:p>
+      <w:pPr>
+        <w:pStyle w:val="Heading2"/>
+      </w:pPr>
+      <w:r>
+        <w:t>6.5 Strengths of the Project</w:t>
+      </w:r>
+    </w:p>
+    <w:p>
+      <w:pPr/>
+      <w:r>
+        <w:t>The project demonstrates several key strengths:</w:t>
+      </w:r>
+    </w:p>
+    <w:p>
+      <w:pPr>
+        <w:pStyle w:val="ListParagraph"/>
+      </w:pPr>
+      <w:r>
+        <w:t>Strong requirement traceability: Stakeholder insights were systematically translated into requirements, design decisions, and implementation features</w:t>
+      </w:r>
+    </w:p>
+    <w:p>
+      <w:pPr>
+        <w:pStyle w:val="ListParagraph"/>
+      </w:pPr>
+      <w:r>
+        <w:t>Focused scope control: By prioritising essential functionality, the system avoids feature overload and maintains usability</w:t>
+      </w:r>
+    </w:p>
+    <w:p>
+      <w:pPr>
+        <w:pStyle w:val="ListParagraph"/>
+      </w:pPr>
+      <w:r>
+        <w:t>Reproducible artefact: The implementation can be recreated and validated using standard development tools</w:t>
+      </w:r>
+    </w:p>
+    <w:p>
+      <w:pPr>
+        <w:pStyle w:val="ListParagraph"/>
+      </w:pPr>
+      <w:r>
+        <w:t>Evidence-based evaluation: Testing combines automated checks, usability observations, and mobile validation to support conclusions</w:t>
+      </w:r>
+    </w:p>
+    <w:p>
+      <w:pPr/>
+      <w:r>
+        <w:t>These strengths align closely with the expectations of a successful final-year project, demonstrating both technical competence and problem-focused design thinking.</w:t>
+      </w:r>
+    </w:p>
+    <w:p>
+      <w:pPr>
+        <w:pStyle w:val="Heading2"/>
+      </w:pPr>
+      <w:r>
+        <w:t>6.6 Limitations</w:t>
+      </w:r>
+    </w:p>
+    <w:p>
+      <w:pPr/>
+      <w:r>
+        <w:t>Despite its strengths, the project has several limitations that should be acknowledged:</w:t>
+      </w:r>
+    </w:p>
+    <w:p>
+      <w:pPr>
+        <w:pStyle w:val="ListParagraph"/>
+      </w:pPr>
+      <w:r>
+        <w:t>The usability evaluation was conducted with a small participant group, limiting the generalisability of findings</w:t>
+      </w:r>
+    </w:p>
+    <w:p>
+      <w:pPr>
+        <w:pStyle w:val="ListParagraph"/>
+      </w:pPr>
+      <w:r>
+        <w:t>Performance and scalability were not explored in depth due to the prototype scope</w:t>
+      </w:r>
+    </w:p>
+    <w:p>
+      <w:pPr>
+        <w:pStyle w:val="ListParagraph"/>
+      </w:pPr>
+      <w:r>
+        <w:t>Notification behaviour could be further refined to improve clarity and responsiveness</w:t>
+      </w:r>
+    </w:p>
+    <w:p>
+      <w:pPr>
+        <w:pStyle w:val="ListParagraph"/>
+      </w:pPr>
+      <w:r>
+        <w:t>The system is not deployed in a live production environment, meaning real-world adoption factors remain untested</w:t>
+      </w:r>
+    </w:p>
+    <w:p>
+      <w:pPr/>
+      <w:r>
+        <w:t>These limitations do not undermine the validity of the project but instead highlight areas for future development and research.</w:t>
+      </w:r>
+    </w:p>
+    <w:p>
+      <w:pPr>
+        <w:pStyle w:val="Heading2"/>
+      </w:pPr>
+      <w:r>
+        <w:t>6.7 Final Reflection</w:t>
+      </w:r>
+    </w:p>
+    <w:p>
+      <w:pPr/>
+      <w:r>
+        <w:t>This project demonstrates that a carefully scoped, stakeholder-driven approach can produce a meaningful and practical solution to a real-world coordination problem. By prioritising simplicity, clarity, and usability, the ASTO system provides an effective alternative to both informal communication methods and overly complex commercial tools.</w:t>
+      </w:r>
+    </w:p>
+    <w:p>
+      <w:pPr/>
+      <w:r>
+        <w:t>The project also reflects a broader principle identified throughout the development process: effective solutions are not necessarily those with the most features, but those that align closely with user needs and context. This principle guided design decisions across all stages of the project and contributed to the coherence of the final artefact.</w:t>
+      </w:r>
+    </w:p>
+    <w:p>
+      <w:pPr>
+        <w:pStyle w:val="Heading2"/>
+      </w:pPr>
+      <w:r>
+        <w:t>6.8 Chapter 6 Conclusion</w:t>
+      </w:r>
+    </w:p>
+    <w:p>
+      <w:pPr/>
+      <w:r>
+        <w:t>The Amateur Sports Team Organiser successfully addresses the coordination challenges identified in amateur sports teams by providing a structured, accessible, and user-focused solution. Through a clear progression from problem identification to system evaluation, the project demonstrates both technical implementation capability and critical understanding of the problem domain.</w:t>
+      </w:r>
+    </w:p>
+    <w:p>
+      <w:pPr/>
+      <w:r>
+        <w:t>The resulting system offers a practical foundation for future development while fulfilling the objectives of the project and contributing a meaningful solution within its intended context.</w:t>
       </w:r>
     </w:p>
     <w:p>

</xml_diff>